<commit_message>
Customize --build-word output: black TNR, Harvard double-spacing, 1.27cm margins, working cross-refs
- custom_thesis_template.docx: all colours -> black (Title/Heading/Hyperlink/
  TOCHeading/AbstractTitle), Hyperlink underline removed, Title 20pt bold,
  Caption 12pt, Heading before/after spacing 0/0, Normal double line spacing
  (line=480), page margins 720 twips (1.27cm) all sides.
- build_word.sh: unwrap \resizebox in the working copy so pandoc registers
  table \label s (fixes [tab:...] cross-refs).
- regenerated 4_outputs/dissertation.docx (10 figures, 0 unresolved refs).
</commit_message>
<xml_diff>
--- a/3_writing/custom_thesis_template.docx
+++ b/3_writing/custom_thesis_template.docx
@@ -382,7 +382,9 @@
 </w:t>
       </w:r>
     </w:p>
-    <w:sectPr/>
+    <w:sectPr>
+      <w:pgMar w:top="720" w:right="720" w:bottom="720" w:left="720" w:header="720" w:footer="720" w:gutter="0"/>
+    </w:sectPr>
   </w:body>
 </w:document>
 </file>
@@ -559,6 +561,9 @@
   </w:docDefaults>
   <w:latentStyles w:defLockedState="0" w:defUIPriority="0" w:defSemiHidden="0" w:defUnhideWhenUsed="0" w:defQFormat="0" w:count="276"/>
   <w:style w:type="paragraph" w:default="1" w:styleId="Normal">
+    <w:pPr>
+      <w:spacing w:after="0" w:line="480" w:lineRule="auto"/>
+    </w:pPr>
     <w:rPr>
       <w:rFonts w:ascii="Times New Roman" w:hAnsi="Times New Roman" w:cs="Times New Roman"/>
       <w:sz w:val="24"/>
@@ -612,11 +617,11 @@
     </w:pPr>
     <w:rPr>
       <w:rFonts w:ascii="Times New Roman" w:hAnsi="Times New Roman" w:cs="Times New Roman"/>
+      <w:color w:val="000000"/>
       <w:b/>
       <w:bCs/>
-      <w:color w:val="345A8A" w:themeColor="accent1" w:themeShade="B5"/>
-      <w:sz w:val="80"/>
-      <w:szCs w:val="80"/>
+      <w:sz w:val="40"/>
+      <w:szCs w:val="40"/>
     </w:rPr>
   </w:style>
   <w:style w:type="paragraph" w:styleId="Subtitle">
@@ -673,8 +678,8 @@
     </w:pPr>
     <w:rPr>
       <w:rFonts w:ascii="Times New Roman" w:hAnsi="Times New Roman" w:cs="Times New Roman"/>
+      <w:color w:val="000000"/>
       <w:b/>
-      <w:color w:val="345A8A"/>
       &gt;
     </w:rPr>
   </w:style>
@@ -711,14 +716,14 @@
     <w:pPr>
       <w:keepNext/>
       <w:keepLines/>
-      <w:spacing w:before="480" w:after="0"/>
+      <w:spacing w:before="0" w:after="0"/>
       <w:outlineLvl w:val="0"/>
     </w:pPr>
     <w:rPr>
       <w:rFonts w:ascii="Times New Roman" w:hAnsi="Times New Roman" w:cs="Times New Roman"/>
+      <w:color w:val="000000"/>
       <w:b/>
       <w:bCs/>
-      <w:color w:val="4F81BD" w:themeColor="accent1"/>
       <w:sz w:val="40"/>
       <w:szCs w:val="40"/>
     </w:rPr>
@@ -733,14 +738,14 @@
     <w:pPr>
       <w:keepNext/>
       <w:keepLines/>
-      <w:spacing w:before="200" w:after="0"/>
+      <w:spacing w:before="0" w:after="0"/>
       <w:outlineLvl w:val="1"/>
     </w:pPr>
     <w:rPr>
       <w:rFonts w:ascii="Times New Roman" w:hAnsi="Times New Roman" w:cs="Times New Roman"/>
+      <w:color w:val="000000"/>
       <w:b/>
       <w:bCs/>
-      <w:color w:val="4F81BD" w:themeColor="accent1"/>
       <w:sz w:val="32"/>
       <w:szCs w:val="32"/>
     </w:rPr>
@@ -755,14 +760,14 @@
     <w:pPr>
       <w:keepNext/>
       <w:keepLines/>
-      <w:spacing w:before="200" w:after="0"/>
+      <w:spacing w:before="0" w:after="0"/>
       <w:outlineLvl w:val="2"/>
     </w:pPr>
     <w:rPr>
       <w:rFonts w:ascii="Times New Roman" w:hAnsi="Times New Roman" w:cs="Times New Roman"/>
+      <w:color w:val="000000"/>
       <w:b/>
       <w:bCs/>
-      <w:color w:val="4F81BD" w:themeColor="accent1"/>
       <w:sz w:val="28"/>
       <w:szCs w:val="28"/>
     </w:rPr>
@@ -777,14 +782,14 @@
     <w:pPr>
       <w:keepNext/>
       <w:keepLines/>
-      <w:spacing w:before="200" w:after="0"/>
+      <w:spacing w:before="0" w:after="0"/>
       <w:outlineLvl w:val="3"/>
     </w:pPr>
     <w:rPr>
       <w:rFonts w:ascii="Times New Roman" w:hAnsi="Times New Roman" w:cs="Times New Roman"/>
+      <w:color w:val="000000"/>
       <w:i/>
       <w:bCs/>
-      <w:color w:val="4F81BD" w:themeColor="accent1"/>
       <w:sz w:val="26"/>
       <w:szCs w:val="26"/>
     </w:rPr>
@@ -799,13 +804,13 @@
     <w:pPr>
       <w:keepNext/>
       <w:keepLines/>
-      <w:spacing w:before="200" w:after="0"/>
+      <w:spacing w:before="0" w:after="0"/>
       <w:outlineLvl w:val="4"/>
     </w:pPr>
     <w:rPr>
       <w:rFonts w:ascii="Times New Roman" w:hAnsi="Times New Roman" w:cs="Times New Roman"/>
+      <w:color w:val="000000"/>
       <w:iCs/>
-      <w:color w:val="4F81BD" w:themeColor="accent1"/>
       <w:sz w:val="24"/>
       <w:szCs w:val="24"/>
     </w:rPr>
@@ -820,12 +825,12 @@
     <w:pPr>
       <w:keepNext/>
       <w:keepLines/>
-      <w:spacing w:before="200" w:after="0"/>
+      <w:spacing w:before="0" w:after="0"/>
       <w:outlineLvl w:val="5"/>
     </w:pPr>
     <w:rPr>
       <w:rFonts w:ascii="Times New Roman" w:hAnsi="Times New Roman" w:cs="Times New Roman"/>
-      <w:color w:val="4F81BD" w:themeColor="accent1"/>
+      <w:color w:val="000000"/>
       <w:sz w:val="24"/>
       <w:szCs w:val="24"/>
     </w:rPr>
@@ -840,12 +845,12 @@
     <w:pPr>
       <w:keepNext/>
       <w:keepLines/>
-      <w:spacing w:before="200" w:after="0"/>
+      <w:spacing w:before="0" w:after="0"/>
       <w:outlineLvl w:val="6"/>
     </w:pPr>
     <w:rPr>
       <w:rFonts w:ascii="Times New Roman" w:hAnsi="Times New Roman" w:cs="Times New Roman"/>
-      <w:color w:val="4F81BD" w:themeColor="accent1"/>
+      <w:color w:val="000000"/>
     </w:rPr>
   </w:style>
   <w:style w:type="paragraph" w:styleId="Heading8">
@@ -858,12 +863,12 @@
     <w:pPr>
       <w:keepNext/>
       <w:keepLines/>
-      <w:spacing w:before="200" w:after="0"/>
+      <w:spacing w:before="0" w:after="0"/>
       <w:outlineLvl w:val="7"/>
     </w:pPr>
     <w:rPr>
       <w:rFonts w:ascii="Times New Roman" w:hAnsi="Times New Roman" w:cs="Times New Roman"/>
-      <w:color w:val="4F81BD" w:themeColor="accent1"/>
+      <w:color w:val="000000"/>
     </w:rPr>
   </w:style>
   <w:style w:type="paragraph" w:styleId="Heading9">
@@ -876,12 +881,12 @@
     <w:pPr>
       <w:keepNext/>
       <w:keepLines/>
-      <w:spacing w:before="200" w:after="0"/>
+      <w:spacing w:before="0" w:after="0"/>
       <w:outlineLvl w:val="8"/>
     </w:pPr>
     <w:rPr>
       <w:rFonts w:ascii="Times New Roman" w:hAnsi="Times New Roman" w:cs="Times New Roman"/>
-      <w:color w:val="4F81BD" w:themeColor="accent1"/>
+      <w:color w:val="000000"/>
     </w:rPr>
   </w:style>
   <w:style w:type="paragraph" w:styleId="BlockText">
@@ -983,8 +988,8 @@
     <w:rPr>
       <w:rFonts w:ascii="Times New Roman" w:hAnsi="Times New Roman" w:cs="Times New Roman"/>
       <w:i/>
-      <w:sz w:val="20"/>
-      <w:szCs w:val="20"/>
+      <w:sz w:val="24"/>
+      <w:szCs w:val="24"/>
     </w:rPr>
   </w:style>
   <w:style w:type="paragraph" w:customStyle="1" w:styleId="TableCaption">
@@ -1056,7 +1061,8 @@
     <w:basedOn w:val="BodyTextChar"/>
     <w:rPr>
       <w:rFonts w:ascii="Times New Roman" w:hAnsi="Times New Roman" w:cs="Times New Roman"/>
-      <w:color w:val="4F81BD" w:themeColor="accent1"/>
+      <w:color w:val="000000"/>
+      <w:u w:val="none"/>
     </w:rPr>
   </w:style>
   <w:style w:type="paragraph" w:styleId="TOCHeading">
@@ -1072,9 +1078,9 @@
     </w:pPr>
     <w:rPr>
       <w:rFonts w:ascii="Times New Roman" w:hAnsi="Times New Roman" w:cs="Times New Roman"/>
+      <w:color w:val="000000"/>
       <w:b w:val="0"/>
       <w:bCs w:val="0"/>
-      <w:color w:val="365F91" w:themeColor="accent1" w:themeShade="BF"/>
     </w:rPr>
   </w:style>
 </w:styles>

</xml_diff>

<commit_message>
Align Word build to UoB thesis guide + Cite Them Right Harvard
- custom_thesis_template.docx: Arial (sans serif), margins 3/3/2 cm, Heading1
  centred + all-caps.
- build_word.sh: --csl harvard-university-of-birmingham.csl (official UoB Harvard /
  Cite Them Right) so the .docx is no longer default Chicago.
- add harvard-university-of-birmingham.csl (citation-style-language repo).
- regenerate 4_outputs/dissertation.docx and dissertation.pdf (both outputs now
  comply: Arial/Helvetica, 3/3/2 cm, double spacing, centred+caps chapters,
  Harvard author-date, alphabetical reference list, 0 unresolved cross-refs).
</commit_message>
<xml_diff>
--- a/3_writing/custom_thesis_template.docx
+++ b/3_writing/custom_thesis_template.docx
@@ -383,7 +383,7 @@
       </w:r>
     </w:p>
     <w:sectPr>
-      <w:pgMar w:top="720" w:right="720" w:bottom="720" w:left="720" w:header="720" w:footer="720" w:gutter="0"/>
+      <w:pgMar w:top="1701" w:right="1134" w:bottom="1701" w:left="1701" w:header="1134" w:footer="1134" w:gutter="0"/>
     </w:sectPr>
   </w:body>
 </w:document>
@@ -565,7 +565,7 @@
       <w:spacing w:after="0" w:line="480" w:lineRule="auto"/>
     </w:pPr>
     <w:rPr>
-      <w:rFonts w:ascii="Times New Roman" w:hAnsi="Times New Roman" w:cs="Times New Roman"/>
+      <w:rFonts w:ascii="Arial" w:hAnsi="Arial" w:cs="Arial"/>
       <w:sz w:val="24"/>
       <w:szCs w:val="24"/>
     </w:rPr>
@@ -574,7 +574,7 @@
   </w:style>
   <w:style w:type="paragraph" w:styleId="BodyText">
     <w:rPr>
-      <w:rFonts w:ascii="Times New Roman" w:hAnsi="Times New Roman" w:cs="Times New Roman"/>
+      <w:rFonts w:ascii="Arial" w:hAnsi="Arial" w:cs="Arial"/>
     </w:rPr>
     <w:name w:val="Body Text"/>
     <w:basedOn w:val="Normal"/>
@@ -586,7 +586,7 @@
   </w:style>
   <w:style w:type="paragraph" w:customStyle="1" w:styleId="FirstParagraph">
     <w:rPr>
-      <w:rFonts w:ascii="Times New Roman" w:hAnsi="Times New Roman" w:cs="Times New Roman"/>
+      <w:rFonts w:ascii="Arial" w:hAnsi="Arial" w:cs="Arial"/>
     </w:rPr>
     <w:name w:val="First Paragraph"/>
     <w:basedOn w:val="BodyText"/>
@@ -595,7 +595,7 @@
   </w:style>
   <w:style w:type="paragraph" w:customStyle="1" w:styleId="Compact">
     <w:rPr>
-      <w:rFonts w:ascii="Times New Roman" w:hAnsi="Times New Roman" w:cs="Times New Roman"/>
+      <w:rFonts w:ascii="Arial" w:hAnsi="Arial" w:cs="Arial"/>
     </w:rPr>
     <w:name w:val="Compact"/>
     <w:basedOn w:val="BodyText"/>
@@ -616,7 +616,7 @@
       <w:jc w:val="center"/>
     </w:pPr>
     <w:rPr>
-      <w:rFonts w:ascii="Times New Roman" w:hAnsi="Times New Roman" w:cs="Times New Roman"/>
+      <w:rFonts w:ascii="Arial" w:hAnsi="Arial" w:cs="Arial"/>
       <w:color w:val="000000"/>
       <w:b/>
       <w:bCs/>
@@ -636,12 +636,12 @@
       <w:jc w:val="center"/>
     </w:pPr>
     <w:rPr>
-      <w:rFonts w:ascii="Times New Roman" w:hAnsi="Times New Roman" w:cs="Times New Roman"/>
+      <w:rFonts w:ascii="Arial" w:hAnsi="Arial" w:cs="Arial"/>
     </w:rPr>
   </w:style>
   <w:style w:type="paragraph" w:customStyle="1" w:styleId="Author">
     <w:rPr>
-      <w:rFonts w:ascii="Times New Roman" w:hAnsi="Times New Roman" w:cs="Times New Roman"/>
+      <w:rFonts w:ascii="Arial" w:hAnsi="Arial" w:cs="Arial"/>
     </w:rPr>
     <w:name w:val="Author"/>
     <w:next w:val="BodyText"/>
@@ -654,7 +654,7 @@
   </w:style>
   <w:style w:type="paragraph" w:styleId="Date">
     <w:rPr>
-      <w:rFonts w:ascii="Times New Roman" w:hAnsi="Times New Roman" w:cs="Times New Roman"/>
+      <w:rFonts w:ascii="Arial" w:hAnsi="Arial" w:cs="Arial"/>
     </w:rPr>
     <w:name w:val="Date"/>
     <w:next w:val="BodyText"/>
@@ -677,7 +677,7 @@
       <w:spacing w:before="300" w:after="0"/>
     </w:pPr>
     <w:rPr>
-      <w:rFonts w:ascii="Times New Roman" w:hAnsi="Times New Roman" w:cs="Times New Roman"/>
+      <w:rFonts w:ascii="Arial" w:hAnsi="Arial" w:cs="Arial"/>
       <w:color w:val="000000"/>
       <w:b/>
       &gt;
@@ -694,7 +694,7 @@
       <w:spacing w:before="100" w:after="300"/>
     </w:pPr>
     <w:rPr>
-      <w:rFonts w:ascii="Times New Roman" w:hAnsi="Times New Roman" w:cs="Times New Roman"/>
+      <w:rFonts w:ascii="Arial" w:hAnsi="Arial" w:cs="Arial"/>
     </w:rPr>
   </w:style>
   <w:style w:type="paragraph" w:styleId="Bibliography">
@@ -704,7 +704,7 @@
     <w:qFormat/>
     <w:pPr/>
     <w:rPr>
-      <w:rFonts w:ascii="Times New Roman" w:hAnsi="Times New Roman" w:cs="Times New Roman"/>
+      <w:rFonts w:ascii="Arial" w:hAnsi="Arial" w:cs="Arial"/>
     </w:rPr>
   </w:style>
   <w:style w:type="paragraph" w:styleId="Heading1">
@@ -714,18 +714,20 @@
     <w:uiPriority w:val="9"/>
     <w:qFormat/>
     <w:pPr>
+      <w:jc w:val="center"/>
       <w:keepNext/>
       <w:keepLines/>
       <w:spacing w:before="0" w:after="0"/>
       <w:outlineLvl w:val="0"/>
     </w:pPr>
     <w:rPr>
-      <w:rFonts w:ascii="Times New Roman" w:hAnsi="Times New Roman" w:cs="Times New Roman"/>
+      <w:rFonts w:ascii="Arial" w:hAnsi="Arial" w:cs="Arial"/>
       <w:color w:val="000000"/>
       <w:b/>
       <w:bCs/>
       <w:sz w:val="40"/>
       <w:szCs w:val="40"/>
+      <w:caps/>
     </w:rPr>
   </w:style>
   <w:style w:type="paragraph" w:styleId="Heading2">
@@ -742,7 +744,7 @@
       <w:outlineLvl w:val="1"/>
     </w:pPr>
     <w:rPr>
-      <w:rFonts w:ascii="Times New Roman" w:hAnsi="Times New Roman" w:cs="Times New Roman"/>
+      <w:rFonts w:ascii="Arial" w:hAnsi="Arial" w:cs="Arial"/>
       <w:color w:val="000000"/>
       <w:b/>
       <w:bCs/>
@@ -764,7 +766,7 @@
       <w:outlineLvl w:val="2"/>
     </w:pPr>
     <w:rPr>
-      <w:rFonts w:ascii="Times New Roman" w:hAnsi="Times New Roman" w:cs="Times New Roman"/>
+      <w:rFonts w:ascii="Arial" w:hAnsi="Arial" w:cs="Arial"/>
       <w:color w:val="000000"/>
       <w:b/>
       <w:bCs/>
@@ -786,7 +788,7 @@
       <w:outlineLvl w:val="3"/>
     </w:pPr>
     <w:rPr>
-      <w:rFonts w:ascii="Times New Roman" w:hAnsi="Times New Roman" w:cs="Times New Roman"/>
+      <w:rFonts w:ascii="Arial" w:hAnsi="Arial" w:cs="Arial"/>
       <w:color w:val="000000"/>
       <w:i/>
       <w:bCs/>
@@ -808,7 +810,7 @@
       <w:outlineLvl w:val="4"/>
     </w:pPr>
     <w:rPr>
-      <w:rFonts w:ascii="Times New Roman" w:hAnsi="Times New Roman" w:cs="Times New Roman"/>
+      <w:rFonts w:ascii="Arial" w:hAnsi="Arial" w:cs="Arial"/>
       <w:color w:val="000000"/>
       <w:iCs/>
       <w:sz w:val="24"/>
@@ -829,7 +831,7 @@
       <w:outlineLvl w:val="5"/>
     </w:pPr>
     <w:rPr>
-      <w:rFonts w:ascii="Times New Roman" w:hAnsi="Times New Roman" w:cs="Times New Roman"/>
+      <w:rFonts w:ascii="Arial" w:hAnsi="Arial" w:cs="Arial"/>
       <w:color w:val="000000"/>
       <w:sz w:val="24"/>
       <w:szCs w:val="24"/>
@@ -849,7 +851,7 @@
       <w:outlineLvl w:val="6"/>
     </w:pPr>
     <w:rPr>
-      <w:rFonts w:ascii="Times New Roman" w:hAnsi="Times New Roman" w:cs="Times New Roman"/>
+      <w:rFonts w:ascii="Arial" w:hAnsi="Arial" w:cs="Arial"/>
       <w:color w:val="000000"/>
     </w:rPr>
   </w:style>
@@ -867,7 +869,7 @@
       <w:outlineLvl w:val="7"/>
     </w:pPr>
     <w:rPr>
-      <w:rFonts w:ascii="Times New Roman" w:hAnsi="Times New Roman" w:cs="Times New Roman"/>
+      <w:rFonts w:ascii="Arial" w:hAnsi="Arial" w:cs="Arial"/>
       <w:color w:val="000000"/>
     </w:rPr>
   </w:style>
@@ -885,13 +887,13 @@
       <w:outlineLvl w:val="8"/>
     </w:pPr>
     <w:rPr>
-      <w:rFonts w:ascii="Times New Roman" w:hAnsi="Times New Roman" w:cs="Times New Roman"/>
+      <w:rFonts w:ascii="Arial" w:hAnsi="Arial" w:cs="Arial"/>
       <w:color w:val="000000"/>
     </w:rPr>
   </w:style>
   <w:style w:type="paragraph" w:styleId="BlockText">
     <w:rPr>
-      <w:rFonts w:ascii="Times New Roman" w:hAnsi="Times New Roman" w:cs="Times New Roman"/>
+      <w:rFonts w:ascii="Arial" w:hAnsi="Arial" w:cs="Arial"/>
     </w:rPr>
     <w:name w:val="Block Text"/>
     <w:basedOn w:val="BodyText"/>
@@ -906,7 +908,7 @@
   </w:style>
   <w:style w:type="paragraph" w:styleId="FootnoteText">
     <w:rPr>
-      <w:rFonts w:ascii="Times New Roman" w:hAnsi="Times New Roman" w:cs="Times New Roman"/>
+      <w:rFonts w:ascii="Arial" w:hAnsi="Arial" w:cs="Arial"/>
     </w:rPr>
     <w:name w:val="Footnote Text"/>
     <w:basedOn w:val="Normal"/>
@@ -917,7 +919,7 @@
   </w:style>
   <w:style w:type="character" w:default="1" w:styleId="DefaultParagraphFont">
     <w:rPr>
-      <w:rFonts w:ascii="Times New Roman" w:hAnsi="Times New Roman" w:cs="Times New Roman"/>
+      <w:rFonts w:ascii="Arial" w:hAnsi="Arial" w:cs="Arial"/>
     </w:rPr>
     <w:name w:val="Default Paragraph Font"/>
     <w:semiHidden/>
@@ -925,7 +927,7 @@
   </w:style>
   <w:style w:type="table" w:default="1" w:styleId="Table">
     <w:rPr>
-      <w:rFonts w:ascii="Times New Roman" w:hAnsi="Times New Roman" w:cs="Times New Roman"/>
+      <w:rFonts w:ascii="Arial" w:hAnsi="Arial" w:cs="Arial"/>
     </w:rPr>
     <w:name w:val="Table"/>
     <w:basedOn w:val="TableNormal"/>
@@ -967,13 +969,13 @@
       <w:spacing w:after="0"/>
     </w:pPr>
     <w:rPr>
-      <w:rFonts w:ascii="Times New Roman" w:hAnsi="Times New Roman" w:cs="Times New Roman"/>
+      <w:rFonts w:ascii="Arial" w:hAnsi="Arial" w:cs="Arial"/>
       <w:b/>
     </w:rPr>
   </w:style>
   <w:style w:type="paragraph" w:customStyle="1" w:styleId="Definition">
     <w:rPr>
-      <w:rFonts w:ascii="Times New Roman" w:hAnsi="Times New Roman" w:cs="Times New Roman"/>
+      <w:rFonts w:ascii="Arial" w:hAnsi="Arial" w:cs="Arial"/>
     </w:rPr>
     <w:name w:val="Definition"/>
     <w:basedOn w:val="Normal"/>
@@ -986,7 +988,7 @@
       <w:spacing w:before="0" w:after="120"/>
     </w:pPr>
     <w:rPr>
-      <w:rFonts w:ascii="Times New Roman" w:hAnsi="Times New Roman" w:cs="Times New Roman"/>
+      <w:rFonts w:ascii="Arial" w:hAnsi="Arial" w:cs="Arial"/>
       <w:i/>
       <w:sz w:val="24"/>
       <w:szCs w:val="24"/>
@@ -994,7 +996,7 @@
   </w:style>
   <w:style w:type="paragraph" w:customStyle="1" w:styleId="TableCaption">
     <w:rPr>
-      <w:rFonts w:ascii="Times New Roman" w:hAnsi="Times New Roman" w:cs="Times New Roman"/>
+      <w:rFonts w:ascii="Arial" w:hAnsi="Arial" w:cs="Arial"/>
     </w:rPr>
     <w:name w:val="Table Caption"/>
     <w:basedOn w:val="Caption"/>
@@ -1004,21 +1006,21 @@
   </w:style>
   <w:style w:type="paragraph" w:customStyle="1" w:styleId="ImageCaption">
     <w:rPr>
-      <w:rFonts w:ascii="Times New Roman" w:hAnsi="Times New Roman" w:cs="Times New Roman"/>
+      <w:rFonts w:ascii="Arial" w:hAnsi="Arial" w:cs="Arial"/>
     </w:rPr>
     <w:name w:val="Image Caption"/>
     <w:basedOn w:val="Caption"/>
   </w:style>
   <w:style w:type="paragraph" w:customStyle="1" w:styleId="Figure">
     <w:rPr>
-      <w:rFonts w:ascii="Times New Roman" w:hAnsi="Times New Roman" w:cs="Times New Roman"/>
+      <w:rFonts w:ascii="Arial" w:hAnsi="Arial" w:cs="Arial"/>
     </w:rPr>
     <w:name w:val="Figure"/>
     <w:basedOn w:val="Normal"/>
   </w:style>
   <w:style w:type="paragraph" w:customStyle="1" w:styleId="CaptionedFigure">
     <w:rPr>
-      <w:rFonts w:ascii="Times New Roman" w:hAnsi="Times New Roman" w:cs="Times New Roman"/>
+      <w:rFonts w:ascii="Arial" w:hAnsi="Arial" w:cs="Arial"/>
     </w:rPr>
     <w:name w:val="Captioned Figure"/>
     <w:basedOn w:val="Figure"/>
@@ -1028,7 +1030,7 @@
   </w:style>
   <w:style w:type="character" w:customStyle="1" w:styleId="BodyTextChar">
     <w:rPr>
-      <w:rFonts w:ascii="Times New Roman" w:hAnsi="Times New Roman" w:cs="Times New Roman"/>
+      <w:rFonts w:ascii="Arial" w:hAnsi="Arial" w:cs="Arial"/>
     </w:rPr>
     <w:name w:val="Body Text Char"/>
     <w:basedOn w:val="DefaultParagraphFont"/>
@@ -1038,12 +1040,12 @@
     <w:name w:val="Verbatim Char"/>
     <w:basedOn w:val="BodyTextChar"/>
     <w:rPr>
-      <w:rFonts w:ascii="Times New Roman" w:hAnsi="Times New Roman" w:cs="Times New Roman"/>
+      <w:rFonts w:ascii="Arial" w:hAnsi="Arial" w:cs="Arial"/>
     </w:rPr>
   </w:style>
   <w:style w:type="character" w:customStyle="1" w:styleId="SectionNumber">
     <w:rPr>
-      <w:rFonts w:ascii="Times New Roman" w:hAnsi="Times New Roman" w:cs="Times New Roman"/>
+      <w:rFonts w:ascii="Arial" w:hAnsi="Arial" w:cs="Arial"/>
     </w:rPr>
     <w:name w:val="Section Number"/>
     <w:basedOn w:val="BodyTextChar"/>
@@ -1052,7 +1054,7 @@
     <w:name w:val="Footnote Reference"/>
     <w:basedOn w:val="BodyTextChar"/>
     <w:rPr>
-      <w:rFonts w:ascii="Times New Roman" w:hAnsi="Times New Roman" w:cs="Times New Roman"/>
+      <w:rFonts w:ascii="Arial" w:hAnsi="Arial" w:cs="Arial"/>
       <w:vertAlign w:val="superscript"/>
     </w:rPr>
   </w:style>
@@ -1060,7 +1062,7 @@
     <w:name w:val="Hyperlink"/>
     <w:basedOn w:val="BodyTextChar"/>
     <w:rPr>
-      <w:rFonts w:ascii="Times New Roman" w:hAnsi="Times New Roman" w:cs="Times New Roman"/>
+      <w:rFonts w:ascii="Arial" w:hAnsi="Arial" w:cs="Arial"/>
       <w:color w:val="000000"/>
       <w:u w:val="none"/>
     </w:rPr>
@@ -1077,7 +1079,7 @@
       <w:outlineLvl w:val="9"/>
     </w:pPr>
     <w:rPr>
-      <w:rFonts w:ascii="Times New Roman" w:hAnsi="Times New Roman" w:cs="Times New Roman"/>
+      <w:rFonts w:ascii="Arial" w:hAnsi="Arial" w:cs="Arial"/>
       <w:color w:val="000000"/>
       <w:b w:val="0"/>
       <w:bCs w:val="0"/>
@@ -1129,15 +1131,15 @@
     </a:clrScheme>
     <a:fontScheme name="Office">
       <a:majorFont>
-        <a:latin typeface="Times New Roman"/>
+        <a:latin typeface="Arial"/>
         <a:ea typeface=""/>
         <a:cs typeface=""/>
         <a:font script="Jpan" typeface="ＭＳ ゴシック"/>
         <a:font script="Hang" typeface="맑은 고딕"/>
         <a:font script="Hans" typeface="宋体"/>
         <a:font script="Hant" typeface="新細明體"/>
-        <a:font script="Arab" typeface="Times New Roman"/>
-        <a:font script="Hebr" typeface="Times New Roman"/>
+        <a:font script="Arab" typeface="Arial"/>
+        <a:font script="Hebr" typeface="Arial"/>
         <a:font script="Thai" typeface="Angsana New"/>
         <a:font script="Ethi" typeface="Nyala"/>
         <a:font script="Beng" typeface="Vrinda"/>
@@ -1159,11 +1161,11 @@
         <a:font script="Laoo" typeface="DokChampa"/>
         <a:font script="Sinh" typeface="Iskoola Pota"/>
         <a:font script="Mong" typeface="Mongolian Baiti"/>
-        <a:font script="Viet" typeface="Times New Roman"/>
+        <a:font script="Viet" typeface="Arial"/>
         <a:font script="Uigh" typeface="Microsoft Uighur"/>
       </a:majorFont>
       <a:minorFont>
-        <a:latin typeface="Times New Roman"/>
+        <a:latin typeface="Arial"/>
         <a:ea typeface=""/>
         <a:cs typeface=""/>
         <a:font script="Jpan" typeface="ＭＳ 明朝"/>

</xml_diff>

<commit_message>
fix: make TOCHeading style bold in Word build
The template's TOCHeading style (used by the Table of Contents / List of
Figures / List of Tables titles) explicitly overrode its Heading1 base
with bold off. Flip <w:b>/<w:bCs> to on so the three front-matter list
titles render bold, and rebuild dissertation.docx. Canon word count
unchanged (8,289).
</commit_message>
<xml_diff>
--- a/3_writing/custom_thesis_template.docx
+++ b/3_writing/custom_thesis_template.docx
@@ -1081,8 +1081,8 @@
     <w:rPr>
       <w:rFonts w:ascii="Arial" w:hAnsi="Arial" w:cs="Arial"/>
       <w:color w:val="000000"/>
-      <w:b w:val="0"/>
-      <w:bCs w:val="0"/>
+      <w:b/>
+      <w:bCs/>
     </w:rPr>
   </w:style>
 </w:styles>

</xml_diff>

<commit_message>
feat: customize Word table formatting (bold headers, single cell spacing, keep-together)
- custom_thesis_template.docx styles: Compact cells single-spaced
  (w:line=240; body stays double via Normal), Table style firstRow rule
  bolded (applies to all header rows via pandoc's tblLook firstRow=1),
  cell padding 108 -> 72 twips
- new 3_writing/style_tables_docx.py, wired into build_word.sh after
  pandoc: cantSplit on all 665 rows, keepNext on 155 header-cell
  paragraphs, and promotion of the 5 caption'd tables whose headers
  pandoc fails to tag (shortstack / multi-row multicolumn) to real
  header rows (tblHeader repeat + tblLook firstRow=1 so bold applies);
  layout tables (no caption) untouched; fails closed on stale template
  or double application; text content untouched
- rebuilt 4_outputs/dissertation.docx; word count unchanged
  (canon 8,289, margin 511)
</commit_message>
<xml_diff>
--- a/3_writing/custom_thesis_template.docx
+++ b/3_writing/custom_thesis_template.docx
@@ -601,7 +601,7 @@
     <w:basedOn w:val="BodyText"/>
     <w:qFormat/>
     <w:pPr>
-      <w:spacing w:before="36" w:after="36"/>
+      <w:spacing w:before="36" w:after="36" w:line="240" w:lineRule="auto"/>
     </w:pPr>
   </w:style>
   <w:style w:type="paragraph" w:styleId="Title">
@@ -938,9 +938,9 @@
       <w:tblInd w:w="0" w:type="dxa"/>
       <w:tblCellMar>
         <w:top w:w="0" w:type="dxa"/>
-        <w:left w:w="108" w:type="dxa"/>
+        <w:left w:w="72" w:type="dxa"/>
         <w:bottom w:w="0" w:type="dxa"/>
-        <w:right w:w="108" w:type="dxa"/>
+        <w:right w:w="72" w:type="dxa"/>
       </w:tblCellMar>
     </w:tblPr>
     <w:tblStylePr w:type="firstRow">
@@ -957,6 +957,9 @@
           <w:bottom w:val="single"/>
         </w:tcBorders>
       </w:tcPr>
+      <w:rPr>
+        <w:b/>
+      </w:rPr>
     </w:tblStylePr>
   </w:style>
   <w:style w:type="paragraph" w:customStyle="1" w:styleId="DefinitionTerm">

</xml_diff>

<commit_message>
feat: center tables, figures, captions and Notes in Word build
- template styles: TableCaption, ImageCaption and CaptionedFigure
  get jc=center (declarative, covers all 35 table captions, 11 image
  captions and 10 figure paragraphs)
- style_tables_docx.py: tblPr jc start->center on all tables (36/36,
  includes the subfigure layout table; per-cell text alignment
  untouched) and jc=center on every Notes: paragraph (30/30, same
  joined-text prefix rule as the word counter, strict pPr shapes,
  fails closed on drift)
- rebuilt docx; all prior properties intact (665 cantSplit, 35
  tblHeader, 155 keepNext); word count unchanged (canon 8,289,
  margin 511)
</commit_message>
<xml_diff>
--- a/3_writing/custom_thesis_template.docx
+++ b/3_writing/custom_thesis_template.docx
@@ -1005,6 +1005,7 @@
     <w:basedOn w:val="Caption"/>
     <w:pPr>
       <w:keepNext/>
+      <w:jc w:val="center"/>
     </w:pPr>
   </w:style>
   <w:style w:type="paragraph" w:customStyle="1" w:styleId="ImageCaption">
@@ -1013,6 +1014,9 @@
     </w:rPr>
     <w:name w:val="Image Caption"/>
     <w:basedOn w:val="Caption"/>
+    <w:pPr>
+      <w:jc w:val="center"/>
+    </w:pPr>
   </w:style>
   <w:style w:type="paragraph" w:customStyle="1" w:styleId="Figure">
     <w:rPr>
@@ -1029,6 +1033,7 @@
     <w:basedOn w:val="Figure"/>
     <w:pPr>
       <w:keepNext/>
+      <w:jc w:val="center"/>
     </w:pPr>
   </w:style>
   <w:style w:type="character" w:customStyle="1" w:styleId="BodyTextChar">

</xml_diff>

<commit_message>
single-space captions, table text, and Notes in Word build
Captions and table text inherit single line-spacing (w:line="240")
declaratively from the template (Caption + Compact styles). Notes
paragraphs share BodyText (double-spaced for prose), so they get
single spacing applied per-paragraph in style_tables_docx.py (item 6).
Template verification expanded to check Caption single-spacing and
Compact zero before/after (item 10).

🤖 Generated with Codebuff
Co-Authored-By: Codebuff <noreply@codebuff.com>
</commit_message>
<xml_diff>
--- a/3_writing/custom_thesis_template.docx
+++ b/3_writing/custom_thesis_template.docx
@@ -601,7 +601,7 @@
     <w:basedOn w:val="BodyText"/>
     <w:qFormat/>
     <w:pPr>
-      <w:spacing w:before="36" w:after="36" w:line="240" w:lineRule="auto"/>
+      <w:spacing w:before="0" w:after="0" w:line="240" w:lineRule="auto"/>
     </w:pPr>
   </w:style>
   <w:style w:type="paragraph" w:styleId="Title">
@@ -988,7 +988,7 @@
     <w:basedOn w:val="Normal"/>
     <w:link w:val="BodyTextChar"/>
     <w:pPr>
-      <w:spacing w:before="0" w:after="120"/>
+      <w:spacing w:before="0" w:after="120" w:line="240" w:lineRule="auto"/>
     </w:pPr>
     <w:rPr>
       <w:rFonts w:ascii="Arial" w:hAnsi="Arial" w:cs="Arial"/>

</xml_diff>